<commit_message>
feat(config): 微信 AppID 落地 + 文档/设计稿口径升 v1.7 / v2.1
- broadband-miniapp/project.config.json：appid 由 touristappid 改为真实 wxcc344ad7f4f849d4
- backend application.yml：app.wechat.miniapp.appid 默认值回填该 AppID，Secret 仍走环境变量 WECHAT_SECRET
- docs/功能进度说明书.md（v1.7）：新增凭证与环境变量清单 5.1；修正师傅端 6 行过期接口口径（/api/admin/* → /api/worker/*，补数据隔离说明）；更新剩余缺口
- docs/项目进度与开发计划.xlsx（v1.7）：新增 AppID 落地行与「外部凭证」统计行；待办 #1 收敛为「注入 WECHAT_SECRET」，新增 #10 AppID 拆分确认；里程碑新增 M10b（Secret 接入）/ M10c（视觉验收）
- broadband-design/index.html（v2.1）：落地状态总览加「微信凭证 90%」行、新增凭证与环境变量表、师傅端页面清单对齐真实接口、后续计划刷新
- scripts/：归档 xlsx 与 md→docx 生成脚本，便于口径复现
</commit_message>
<xml_diff>
--- a/docs/功能进度说明书.docx
+++ b/docs/功能进度说明书.docx
@@ -27,9 +27,198 @@
           <w:color w:val="555555"/>
           <w:sz w:val="19"/>
         </w:rPr>
-        <w:t>文档版本：v1.6 ｜ 对应设计稿：v1.9 ｜ 更新日期：2026-09-14</w:t>
+        <w:t>文档版本：v1.7 ｜ 对应设计稿：v2.1 ｜ 更新日期：2026-09-15</w:t>
         <w:br/>
         <w:t>目的：清晰呈现各功能模块「已完成 / 部分完成 / 规划中」的现状，对齐研发、产品与运营预期。</w:t>
+        <w:br/>
+      </w:r>
+      <w:r>
+        <w:rPr>
+          <w:rFonts w:ascii="宋体" w:hAnsi="宋体" w:eastAsia="宋体"/>
+          <w:b/>
+          <w:color w:val="555555"/>
+          <w:sz w:val="19"/>
+        </w:rPr>
+        <w:t>v1.7 变更</w:t>
+      </w:r>
+      <w:r>
+        <w:rPr>
+          <w:rFonts w:ascii="宋体" w:hAnsi="宋体" w:eastAsia="宋体"/>
+          <w:b w:val="0"/>
+          <w:color w:val="555555"/>
+          <w:sz w:val="19"/>
+        </w:rPr>
+        <w:t>：M10 收尾「凭证落地 + 文档与实现对齐」——</w:t>
+        <w:br/>
+        <w:t xml:space="preserve">① 客户端小程序 </w:t>
+      </w:r>
+      <w:r>
+        <w:rPr>
+          <w:rFonts w:ascii="Consolas" w:hAnsi="Consolas" w:eastAsia="Consolas"/>
+          <w:b w:val="0"/>
+          <w:color w:val="C0392B"/>
+          <w:sz w:val="18"/>
+        </w:rPr>
+        <w:t>project.config.json</w:t>
+      </w:r>
+      <w:r>
+        <w:rPr>
+          <w:rFonts w:ascii="宋体" w:hAnsi="宋体" w:eastAsia="宋体"/>
+          <w:b w:val="0"/>
+          <w:color w:val="555555"/>
+          <w:sz w:val="19"/>
+        </w:rPr>
+        <w:t xml:space="preserve"> 已写入</w:t>
+      </w:r>
+      <w:r>
+        <w:rPr>
+          <w:rFonts w:ascii="宋体" w:hAnsi="宋体" w:eastAsia="宋体"/>
+          <w:b/>
+          <w:color w:val="555555"/>
+          <w:sz w:val="19"/>
+        </w:rPr>
+        <w:t>真实 AppID `wxcc344ad7f4f849d4`</w:t>
+      </w:r>
+      <w:r>
+        <w:rPr>
+          <w:rFonts w:ascii="宋体" w:hAnsi="宋体" w:eastAsia="宋体"/>
+          <w:b w:val="0"/>
+          <w:color w:val="555555"/>
+          <w:sz w:val="19"/>
+        </w:rPr>
+        <w:t xml:space="preserve">（不再使用 </w:t>
+      </w:r>
+      <w:r>
+        <w:rPr>
+          <w:rFonts w:ascii="Consolas" w:hAnsi="Consolas" w:eastAsia="Consolas"/>
+          <w:b w:val="0"/>
+          <w:color w:val="C0392B"/>
+          <w:sz w:val="18"/>
+        </w:rPr>
+        <w:t>touristappid</w:t>
+      </w:r>
+      <w:r>
+        <w:rPr>
+          <w:rFonts w:ascii="宋体" w:hAnsi="宋体" w:eastAsia="宋体"/>
+          <w:b w:val="0"/>
+          <w:color w:val="555555"/>
+          <w:sz w:val="19"/>
+        </w:rPr>
+        <w:t xml:space="preserve">），后端 </w:t>
+      </w:r>
+      <w:r>
+        <w:rPr>
+          <w:rFonts w:ascii="Consolas" w:hAnsi="Consolas" w:eastAsia="Consolas"/>
+          <w:b w:val="0"/>
+          <w:color w:val="C0392B"/>
+          <w:sz w:val="18"/>
+        </w:rPr>
+        <w:t>application.yml</w:t>
+      </w:r>
+      <w:r>
+        <w:rPr>
+          <w:rFonts w:ascii="宋体" w:hAnsi="宋体" w:eastAsia="宋体"/>
+          <w:b w:val="0"/>
+          <w:color w:val="555555"/>
+          <w:sz w:val="19"/>
+        </w:rPr>
+        <w:t xml:space="preserve"> 的 </w:t>
+      </w:r>
+      <w:r>
+        <w:rPr>
+          <w:rFonts w:ascii="Consolas" w:hAnsi="Consolas" w:eastAsia="Consolas"/>
+          <w:b w:val="0"/>
+          <w:color w:val="C0392B"/>
+          <w:sz w:val="18"/>
+        </w:rPr>
+        <w:t>app.wechat.miniapp.appid</w:t>
+      </w:r>
+      <w:r>
+        <w:rPr>
+          <w:rFonts w:ascii="宋体" w:hAnsi="宋体" w:eastAsia="宋体"/>
+          <w:b w:val="0"/>
+          <w:color w:val="555555"/>
+          <w:sz w:val="19"/>
+        </w:rPr>
+        <w:t xml:space="preserve"> 同步设默认值为该 AppID，</w:t>
+      </w:r>
+      <w:r>
+        <w:rPr>
+          <w:rFonts w:ascii="宋体" w:hAnsi="宋体" w:eastAsia="宋体"/>
+          <w:b/>
+          <w:color w:val="555555"/>
+          <w:sz w:val="19"/>
+        </w:rPr>
+        <w:t>只需再注入环境变量 `WECHAT_SECRET` 即自动切换真实 `code2Session` 登录</w:t>
+      </w:r>
+      <w:r>
+        <w:rPr>
+          <w:rFonts w:ascii="宋体" w:hAnsi="宋体" w:eastAsia="宋体"/>
+          <w:b w:val="0"/>
+          <w:color w:val="555555"/>
+          <w:sz w:val="19"/>
+        </w:rPr>
+        <w:t>；</w:t>
+        <w:br/>
+        <w:t xml:space="preserve">② 修正第 2 节师傅端 6 行已过期的接口口径：M10 起已由后台端点 </w:t>
+      </w:r>
+      <w:r>
+        <w:rPr>
+          <w:rFonts w:ascii="Consolas" w:hAnsi="Consolas" w:eastAsia="Consolas"/>
+          <w:b w:val="0"/>
+          <w:color w:val="C0392B"/>
+          <w:sz w:val="18"/>
+        </w:rPr>
+        <w:t>/api/admin/work-orders</w:t>
+      </w:r>
+      <w:r>
+        <w:rPr>
+          <w:rFonts w:ascii="宋体" w:hAnsi="宋体" w:eastAsia="宋体"/>
+          <w:b w:val="0"/>
+          <w:color w:val="555555"/>
+          <w:sz w:val="19"/>
+        </w:rPr>
+        <w:t xml:space="preserve"> 改为专属端点 </w:t>
+      </w:r>
+      <w:r>
+        <w:rPr>
+          <w:rFonts w:ascii="Consolas" w:hAnsi="Consolas" w:eastAsia="Consolas"/>
+          <w:b w:val="0"/>
+          <w:color w:val="C0392B"/>
+          <w:sz w:val="18"/>
+        </w:rPr>
+        <w:t>/api/worker/*</w:t>
+      </w:r>
+      <w:r>
+        <w:rPr>
+          <w:rFonts w:ascii="宋体" w:hAnsi="宋体" w:eastAsia="宋体"/>
+          <w:b w:val="0"/>
+          <w:color w:val="555555"/>
+          <w:sz w:val="19"/>
+        </w:rPr>
+        <w:t>（服务端按 token 隔离）；</w:t>
+        <w:br/>
+        <w:t>③ 新增第 5 节「外部凭证与环境变量」清单，明确「已就绪 / 待注入」边界；</w:t>
+        <w:br/>
+        <w:t xml:space="preserve">④ 口径复核：接口 56（GET 36 / POST 15 / PUT 5）、web-admin 25 </w:t>
+      </w:r>
+      <w:r>
+        <w:rPr>
+          <w:rFonts w:ascii="Consolas" w:hAnsi="Consolas" w:eastAsia="Consolas"/>
+          <w:b w:val="0"/>
+          <w:color w:val="C0392B"/>
+          <w:sz w:val="18"/>
+        </w:rPr>
+        <w:t>.vue</w:t>
+      </w:r>
+      <w:r>
+        <w:rPr>
+          <w:rFonts w:ascii="宋体" w:hAnsi="宋体" w:eastAsia="宋体"/>
+          <w:b w:val="0"/>
+          <w:color w:val="555555"/>
+          <w:sz w:val="19"/>
+        </w:rPr>
+        <w:t>（22 业务页 + 登录 + 403 + 404）/ 22 路由、客户端 20 页、师傅端 8 页、DB 25 张表，四项均与源码实测一致。</w:t>
         <w:br/>
       </w:r>
       <w:r>
@@ -4157,7 +4346,7 @@
                 <w:b w:val="0"/>
                 <w:sz w:val="19"/>
               </w:rPr>
-              <w:t>今日工单概览 + 容量/排班快捷入口</w:t>
+              <w:t>今日工单概览（统计卡）+ 快捷入口</w:t>
             </w:r>
           </w:p>
         </w:tc>
@@ -4173,7 +4362,7 @@
                 <w:b w:val="0"/>
                 <w:sz w:val="19"/>
               </w:rPr>
-              <w:t>GET /admin/work-orders</w:t>
+              <w:t>GET /api/worker/summary</w:t>
             </w:r>
           </w:p>
         </w:tc>
@@ -4243,7 +4432,15 @@
                 <w:b w:val="0"/>
                 <w:sz w:val="19"/>
               </w:rPr>
-              <w:t>工单列表（待接/进行中/已完成）+ 详情</w:t>
+              <w:t>列表（待接/进行中/已完成）+ 详情，</w:t>
+            </w:r>
+            <w:r>
+              <w:rPr>
+                <w:rFonts w:ascii="宋体" w:hAnsi="宋体" w:eastAsia="宋体"/>
+                <w:b/>
+                <w:sz w:val="19"/>
+              </w:rPr>
+              <w:t>服务端按 token 只返回本人工单</w:t>
             </w:r>
           </w:p>
         </w:tc>
@@ -4260,7 +4457,7 @@
                 <w:b w:val="0"/>
                 <w:sz w:val="19"/>
               </w:rPr>
-              <w:t>GET /admin/work-orders · GET /{id}</w:t>
+              <w:t>GET /api/worker/work-orders · GET /api/worker/work-orders/{id}</w:t>
             </w:r>
           </w:p>
         </w:tc>
@@ -4326,7 +4523,15 @@
                 <w:b w:val="0"/>
                 <w:sz w:val="19"/>
               </w:rPr>
-              <w:t>完工拍照/测速结果上传 + 提交</w:t>
+              <w:t>测速/签名/服务项提交并置 DONE，</w:t>
+            </w:r>
+            <w:r>
+              <w:rPr>
+                <w:rFonts w:ascii="宋体" w:hAnsi="宋体" w:eastAsia="宋体"/>
+                <w:b/>
+                <w:sz w:val="19"/>
+              </w:rPr>
+              <w:t>越权工单返回 400</w:t>
             </w:r>
           </w:p>
         </w:tc>
@@ -4342,7 +4547,7 @@
                 <w:b w:val="0"/>
                 <w:sz w:val="19"/>
               </w:rPr>
-              <w:t>POST /admin/work-orders（状态）</w:t>
+              <w:t>POST /api/worker/work-orders/{id}/complete</w:t>
             </w:r>
           </w:p>
         </w:tc>
@@ -4409,10 +4614,18 @@
             <w:r>
               <w:rPr>
                 <w:rFonts w:ascii="宋体" w:hAnsi="宋体" w:eastAsia="宋体"/>
-                <w:b w:val="0"/>
-                <w:sz w:val="19"/>
-              </w:rPr>
-              <w:t>时段容量热力 + 个人容量配置</w:t>
+                <w:b/>
+                <w:sz w:val="19"/>
+              </w:rPr>
+              <w:t>本人</w:t>
+            </w:r>
+            <w:r>
+              <w:rPr>
+                <w:rFonts w:ascii="宋体" w:hAnsi="宋体" w:eastAsia="宋体"/>
+                <w:b w:val="0"/>
+                <w:sz w:val="19"/>
+              </w:rPr>
+              <w:t>时段容量占用看板（原全局容量）</w:t>
             </w:r>
           </w:p>
         </w:tc>
@@ -4429,7 +4642,7 @@
                 <w:b w:val="0"/>
                 <w:sz w:val="19"/>
               </w:rPr>
-              <w:t>GET /api/dispatch/capacity · GET /admin/workers</w:t>
+              <w:t>GET /api/worker/capacity</w:t>
             </w:r>
           </w:p>
         </w:tc>
@@ -4495,7 +4708,7 @@
                 <w:b w:val="0"/>
                 <w:sz w:val="19"/>
               </w:rPr>
-              <w:t>当日工单路线/顺序规划（相邻优先）</w:t>
+              <w:t>未来 7 天排班 + 当日工单顺序（相邻优先）</w:t>
             </w:r>
           </w:p>
         </w:tc>
@@ -4511,7 +4724,7 @@
                 <w:b w:val="0"/>
                 <w:sz w:val="19"/>
               </w:rPr>
-              <w:t>—（前端排程展示）</w:t>
+              <w:t>GET /api/worker/schedule</w:t>
             </w:r>
           </w:p>
         </w:tc>
@@ -4581,7 +4794,41 @@
                 <w:b w:val="0"/>
                 <w:sz w:val="19"/>
               </w:rPr>
-              <w:t>装机测速结果录入（达标判定参考 SLA 引擎）</w:t>
+              <w:t>装机测速结果录入（</w:t>
+            </w:r>
+            <w:r>
+              <w:rPr>
+                <w:rFonts w:ascii="Consolas" w:hAnsi="Consolas" w:eastAsia="Consolas"/>
+                <w:b w:val="0"/>
+                <w:color w:val="C0392B"/>
+                <w:sz w:val="18"/>
+              </w:rPr>
+              <w:t>down_speed</w:t>
+            </w:r>
+            <w:r>
+              <w:rPr>
+                <w:rFonts w:ascii="宋体" w:hAnsi="宋体" w:eastAsia="宋体"/>
+                <w:b w:val="0"/>
+                <w:sz w:val="19"/>
+              </w:rPr>
+              <w:t>/</w:t>
+            </w:r>
+            <w:r>
+              <w:rPr>
+                <w:rFonts w:ascii="Consolas" w:hAnsi="Consolas" w:eastAsia="Consolas"/>
+                <w:b w:val="0"/>
+                <w:color w:val="C0392B"/>
+                <w:sz w:val="18"/>
+              </w:rPr>
+              <w:t>up_speed</w:t>
+            </w:r>
+            <w:r>
+              <w:rPr>
+                <w:rFonts w:ascii="宋体" w:hAnsi="宋体" w:eastAsia="宋体"/>
+                <w:b w:val="0"/>
+                <w:sz w:val="19"/>
+              </w:rPr>
+              <w:t xml:space="preserve"> 落库，达标判定参考 SLA 引擎）</w:t>
             </w:r>
           </w:p>
         </w:tc>
@@ -4598,7 +4845,7 @@
                 <w:b w:val="0"/>
                 <w:sz w:val="19"/>
               </w:rPr>
-              <w:t>POST /api/sla/evaluate</w:t>
+              <w:t>POST /api/sla/evaluate · POST /api/worker/…/complete</w:t>
             </w:r>
           </w:p>
         </w:tc>
@@ -4842,7 +5089,7 @@
                 <w:b w:val="0"/>
                 <w:sz w:val="19"/>
               </w:rPr>
-              <w:t xml:space="preserve">手机号登录改调真实 </w:t>
+              <w:t xml:space="preserve">手机号登录调真实 </w:t>
             </w:r>
             <w:r>
               <w:rPr>
@@ -5004,6 +5251,194 @@
       </w:tr>
     </w:tbl>
     <w:p/>
+    <w:p>
+      <w:pPr>
+        <w:ind w:left="227"/>
+      </w:pPr>
+      <w:r>
+        <w:rPr>
+          <w:rFonts w:ascii="宋体" w:hAnsi="宋体" w:eastAsia="宋体"/>
+          <w:b/>
+          <w:color w:val="555555"/>
+          <w:sz w:val="19"/>
+        </w:rPr>
+        <w:t>AppID 已配置</w:t>
+      </w:r>
+      <w:r>
+        <w:rPr>
+          <w:rFonts w:ascii="宋体" w:hAnsi="宋体" w:eastAsia="宋体"/>
+          <w:b w:val="0"/>
+          <w:color w:val="555555"/>
+          <w:sz w:val="19"/>
+        </w:rPr>
+        <w:t xml:space="preserve">：客户端与师傅端 </w:t>
+      </w:r>
+      <w:r>
+        <w:rPr>
+          <w:rFonts w:ascii="Consolas" w:hAnsi="Consolas" w:eastAsia="Consolas"/>
+          <w:b w:val="0"/>
+          <w:color w:val="C0392B"/>
+          <w:sz w:val="18"/>
+        </w:rPr>
+        <w:t>project.config.json</w:t>
+      </w:r>
+      <w:r>
+        <w:rPr>
+          <w:rFonts w:ascii="宋体" w:hAnsi="宋体" w:eastAsia="宋体"/>
+          <w:b w:val="0"/>
+          <w:color w:val="555555"/>
+          <w:sz w:val="19"/>
+        </w:rPr>
+        <w:t xml:space="preserve"> 均已写入真实 AppID </w:t>
+      </w:r>
+      <w:r>
+        <w:rPr>
+          <w:rFonts w:ascii="宋体" w:hAnsi="宋体" w:eastAsia="宋体"/>
+          <w:b/>
+          <w:color w:val="555555"/>
+          <w:sz w:val="19"/>
+        </w:rPr>
+        <w:t>`wxcc344ad7f4f849d4`</w:t>
+      </w:r>
+      <w:r>
+        <w:rPr>
+          <w:rFonts w:ascii="宋体" w:hAnsi="宋体" w:eastAsia="宋体"/>
+          <w:b w:val="0"/>
+          <w:color w:val="555555"/>
+          <w:sz w:val="19"/>
+        </w:rPr>
+        <w:t xml:space="preserve">（此前为 </w:t>
+      </w:r>
+      <w:r>
+        <w:rPr>
+          <w:rFonts w:ascii="Consolas" w:hAnsi="Consolas" w:eastAsia="Consolas"/>
+          <w:b w:val="0"/>
+          <w:color w:val="C0392B"/>
+          <w:sz w:val="18"/>
+        </w:rPr>
+        <w:t>touristappid</w:t>
+      </w:r>
+      <w:r>
+        <w:rPr>
+          <w:rFonts w:ascii="宋体" w:hAnsi="宋体" w:eastAsia="宋体"/>
+          <w:b w:val="0"/>
+          <w:color w:val="555555"/>
+          <w:sz w:val="19"/>
+        </w:rPr>
+        <w:t>）。</w:t>
+        <w:br/>
+        <w:t>⚠️ 两端当前</w:t>
+      </w:r>
+      <w:r>
+        <w:rPr>
+          <w:rFonts w:ascii="宋体" w:hAnsi="宋体" w:eastAsia="宋体"/>
+          <w:b/>
+          <w:color w:val="555555"/>
+          <w:sz w:val="19"/>
+        </w:rPr>
+        <w:t>共用同一 AppID</w:t>
+      </w:r>
+      <w:r>
+        <w:rPr>
+          <w:rFonts w:ascii="宋体" w:hAnsi="宋体" w:eastAsia="宋体"/>
+          <w:b w:val="0"/>
+          <w:color w:val="555555"/>
+          <w:sz w:val="19"/>
+        </w:rPr>
+        <w:t xml:space="preserve">，而设计上是两个独立小程序——正式提审前需由负责人确认：走「同主体多端」方案（后台同 AppID 注册两端），还是为师傅端单独申请 AppID 并回填 </w:t>
+      </w:r>
+      <w:r>
+        <w:rPr>
+          <w:rFonts w:ascii="Consolas" w:hAnsi="Consolas" w:eastAsia="Consolas"/>
+          <w:b w:val="0"/>
+          <w:color w:val="C0392B"/>
+          <w:sz w:val="18"/>
+        </w:rPr>
+        <w:t>broadband-worker/project.config.json</w:t>
+      </w:r>
+      <w:r>
+        <w:rPr>
+          <w:rFonts w:ascii="宋体" w:hAnsi="宋体" w:eastAsia="宋体"/>
+          <w:b w:val="0"/>
+          <w:color w:val="555555"/>
+          <w:sz w:val="19"/>
+        </w:rPr>
+        <w:t>。</w:t>
+        <w:br/>
+      </w:r>
+      <w:r>
+        <w:rPr>
+          <w:rFonts w:ascii="宋体" w:hAnsi="宋体" w:eastAsia="宋体"/>
+          <w:b/>
+          <w:color w:val="555555"/>
+          <w:sz w:val="19"/>
+        </w:rPr>
+        <w:t>数据隔离（M10）</w:t>
+      </w:r>
+      <w:r>
+        <w:rPr>
+          <w:rFonts w:ascii="宋体" w:hAnsi="宋体" w:eastAsia="宋体"/>
+          <w:b w:val="0"/>
+          <w:color w:val="555555"/>
+          <w:sz w:val="19"/>
+        </w:rPr>
+        <w:t xml:space="preserve">：上述 </w:t>
+      </w:r>
+      <w:r>
+        <w:rPr>
+          <w:rFonts w:ascii="Consolas" w:hAnsi="Consolas" w:eastAsia="Consolas"/>
+          <w:b w:val="0"/>
+          <w:color w:val="C0392B"/>
+          <w:sz w:val="18"/>
+        </w:rPr>
+        <w:t>/api/worker/*</w:t>
+      </w:r>
+      <w:r>
+        <w:rPr>
+          <w:rFonts w:ascii="宋体" w:hAnsi="宋体" w:eastAsia="宋体"/>
+          <w:b w:val="0"/>
+          <w:color w:val="555555"/>
+          <w:sz w:val="19"/>
+        </w:rPr>
+        <w:t xml:space="preserve"> 端点统一由服务端按 JWT 中的 </w:t>
+      </w:r>
+      <w:r>
+        <w:rPr>
+          <w:rFonts w:ascii="Consolas" w:hAnsi="Consolas" w:eastAsia="Consolas"/>
+          <w:b w:val="0"/>
+          <w:color w:val="C0392B"/>
+          <w:sz w:val="18"/>
+        </w:rPr>
+        <w:t>workerId</w:t>
+      </w:r>
+      <w:r>
+        <w:rPr>
+          <w:rFonts w:ascii="宋体" w:hAnsi="宋体" w:eastAsia="宋体"/>
+          <w:b w:val="0"/>
+          <w:color w:val="555555"/>
+          <w:sz w:val="19"/>
+        </w:rPr>
+        <w:t xml:space="preserve"> 过滤，客户端 </w:t>
+      </w:r>
+      <w:r>
+        <w:rPr>
+          <w:rFonts w:ascii="Consolas" w:hAnsi="Consolas" w:eastAsia="Consolas"/>
+          <w:b w:val="0"/>
+          <w:color w:val="C0392B"/>
+          <w:sz w:val="18"/>
+        </w:rPr>
+        <w:t>?workerId=</w:t>
+      </w:r>
+      <w:r>
+        <w:rPr>
+          <w:rFonts w:ascii="宋体" w:hAnsi="宋体" w:eastAsia="宋体"/>
+          <w:b w:val="0"/>
+          <w:color w:val="555555"/>
+          <w:sz w:val="19"/>
+        </w:rPr>
+        <w:t xml:space="preserve"> 传参被忽略，杜绝越权查看他人单。</w:t>
+      </w:r>
+    </w:p>
     <w:p>
       <w:pPr>
         <w:pStyle w:val="Heading1"/>
@@ -10857,7 +11292,7 @@
         </w:rPr>
         <w:t>（c 端开放层，登录态已接入真实 JWT 鉴权）。</w:t>
         <w:br/>
-        <w:t xml:space="preserve">剩余缺口：① 微信真实凭证（AppID/Secret）未提供，当前登录走演示码 </w:t>
+        <w:t xml:space="preserve">剩余缺口：① 微信 AppSecret 未注入，登录当前仍走演示码 </w:t>
       </w:r>
       <w:r>
         <w:rPr>
@@ -10875,11 +11310,663 @@
           <w:color w:val="555555"/>
           <w:sz w:val="19"/>
         </w:rPr>
-        <w:t xml:space="preserve"> 回退路径（双路径代码已就绪，配好即自动切换）；</w:t>
+        <w:t xml:space="preserve"> 回退路径（AppID 已就位，仅需导出环境变量 </w:t>
+      </w:r>
+      <w:r>
+        <w:rPr>
+          <w:rFonts w:ascii="Consolas" w:hAnsi="Consolas" w:eastAsia="Consolas"/>
+          <w:b w:val="0"/>
+          <w:color w:val="C0392B"/>
+          <w:sz w:val="18"/>
+        </w:rPr>
+        <w:t>WECHAT_SECRET</w:t>
+      </w:r>
+      <w:r>
+        <w:rPr>
+          <w:rFonts w:ascii="宋体" w:hAnsi="宋体" w:eastAsia="宋体"/>
+          <w:b w:val="0"/>
+          <w:color w:val="555555"/>
+          <w:sz w:val="19"/>
+        </w:rPr>
+        <w:t xml:space="preserve"> 即可自动切到 </w:t>
+      </w:r>
+      <w:r>
+        <w:rPr>
+          <w:rFonts w:ascii="Consolas" w:hAnsi="Consolas" w:eastAsia="Consolas"/>
+          <w:b w:val="0"/>
+          <w:color w:val="C0392B"/>
+          <w:sz w:val="18"/>
+        </w:rPr>
+        <w:t>code2Session</w:t>
+      </w:r>
+      <w:r>
+        <w:rPr>
+          <w:rFonts w:ascii="宋体" w:hAnsi="宋体" w:eastAsia="宋体"/>
+          <w:b w:val="0"/>
+          <w:color w:val="555555"/>
+          <w:sz w:val="19"/>
+        </w:rPr>
+        <w:t>）；</w:t>
         <w:br/>
-        <w:t>② 师傅端数据绑定（工单列表/排班/容量）与页面视觉验收尚未完成；③ 下单→派单→装机→SLA→评价的业务闭环未端到端联调（支付可后置）。</w:t>
+        <w:t>② 师傅端页面视觉验收（无浏览器，需微信开发者工具导入后截图）；③ 下单→派单→装机→SLA→评价的业务闭环未端到端联调（支付可后置）。</w:t>
       </w:r>
     </w:p>
+    <w:p>
+      <w:pPr>
+        <w:pStyle w:val="Heading2"/>
+      </w:pPr>
+      <w:r>
+        <w:rPr>
+          <w:rFonts w:ascii="微软雅黑" w:hAnsi="微软雅黑" w:eastAsia="微软雅黑"/>
+          <w:b/>
+          <w:color w:val="1F4E79"/>
+          <w:sz w:val="25"/>
+        </w:rPr>
+        <w:t>5.1 外部凭证与环境变量清单（v1.7 新增）</w:t>
+      </w:r>
+    </w:p>
+    <w:tbl>
+      <w:tblPr>
+        <w:tblStyle w:val="TableGrid"/>
+        <w:tblW w:type="auto" w:w="0"/>
+        <w:jc w:val="center"/>
+        <w:tblLook w:firstColumn="1" w:firstRow="1" w:lastColumn="0" w:lastRow="0" w:noHBand="0" w:noVBand="1" w:val="04A0"/>
+      </w:tblPr>
+      <w:tblGrid>
+        <w:gridCol w:w="2436"/>
+        <w:gridCol w:w="2436"/>
+        <w:gridCol w:w="2436"/>
+        <w:gridCol w:w="2436"/>
+      </w:tblGrid>
+      <w:tr>
+        <w:tc>
+          <w:tcPr>
+            <w:tcW w:type="dxa" w:w="2436"/>
+            <w:shd w:val="clear" w:color="auto" w:fill="1F4E79"/>
+          </w:tcPr>
+          <w:p>
+            <w:r/>
+            <w:r>
+              <w:rPr>
+                <w:rFonts w:ascii="微软雅黑" w:hAnsi="微软雅黑" w:eastAsia="微软雅黑"/>
+                <w:b/>
+                <w:color w:val="FFFFFF"/>
+                <w:sz w:val="19"/>
+              </w:rPr>
+              <w:t>凭证 / 变量</w:t>
+            </w:r>
+          </w:p>
+        </w:tc>
+        <w:tc>
+          <w:tcPr>
+            <w:tcW w:type="dxa" w:w="2436"/>
+            <w:shd w:val="clear" w:color="auto" w:fill="1F4E79"/>
+          </w:tcPr>
+          <w:p>
+            <w:r/>
+            <w:r>
+              <w:rPr>
+                <w:rFonts w:ascii="微软雅黑" w:hAnsi="微软雅黑" w:eastAsia="微软雅黑"/>
+                <w:b/>
+                <w:color w:val="FFFFFF"/>
+                <w:sz w:val="19"/>
+              </w:rPr>
+              <w:t>位置</w:t>
+            </w:r>
+          </w:p>
+        </w:tc>
+        <w:tc>
+          <w:tcPr>
+            <w:tcW w:type="dxa" w:w="2436"/>
+            <w:shd w:val="clear" w:color="auto" w:fill="1F4E79"/>
+          </w:tcPr>
+          <w:p>
+            <w:r/>
+            <w:r>
+              <w:rPr>
+                <w:rFonts w:ascii="微软雅黑" w:hAnsi="微软雅黑" w:eastAsia="微软雅黑"/>
+                <w:b/>
+                <w:color w:val="FFFFFF"/>
+                <w:sz w:val="19"/>
+              </w:rPr>
+              <w:t>状态</w:t>
+            </w:r>
+          </w:p>
+        </w:tc>
+        <w:tc>
+          <w:tcPr>
+            <w:tcW w:type="dxa" w:w="2436"/>
+            <w:shd w:val="clear" w:color="auto" w:fill="1F4E79"/>
+          </w:tcPr>
+          <w:p>
+            <w:r/>
+            <w:r>
+              <w:rPr>
+                <w:rFonts w:ascii="微软雅黑" w:hAnsi="微软雅黑" w:eastAsia="微软雅黑"/>
+                <w:b/>
+                <w:color w:val="FFFFFF"/>
+                <w:sz w:val="19"/>
+              </w:rPr>
+              <w:t>说明</w:t>
+            </w:r>
+          </w:p>
+        </w:tc>
+      </w:tr>
+      <w:tr>
+        <w:tc>
+          <w:tcPr>
+            <w:tcW w:type="dxa" w:w="2436"/>
+          </w:tcPr>
+          <w:p>
+            <w:r/>
+            <w:r>
+              <w:rPr>
+                <w:rFonts w:ascii="宋体" w:hAnsi="宋体" w:eastAsia="宋体"/>
+                <w:b w:val="0"/>
+                <w:sz w:val="19"/>
+              </w:rPr>
+              <w:t>微信小程序 AppID</w:t>
+            </w:r>
+          </w:p>
+        </w:tc>
+        <w:tc>
+          <w:tcPr>
+            <w:tcW w:type="dxa" w:w="2436"/>
+          </w:tcPr>
+          <w:p>
+            <w:r/>
+            <w:r>
+              <w:rPr>
+                <w:rFonts w:ascii="Consolas" w:hAnsi="Consolas" w:eastAsia="Consolas"/>
+                <w:b w:val="0"/>
+                <w:color w:val="C0392B"/>
+                <w:sz w:val="18"/>
+              </w:rPr>
+              <w:t>broadband-miniapp/project.config.json</w:t>
+            </w:r>
+            <w:r>
+              <w:rPr>
+                <w:rFonts w:ascii="宋体" w:hAnsi="宋体" w:eastAsia="宋体"/>
+                <w:b w:val="0"/>
+                <w:sz w:val="19"/>
+              </w:rPr>
+              <w:t xml:space="preserve"> · </w:t>
+            </w:r>
+            <w:r>
+              <w:rPr>
+                <w:rFonts w:ascii="Consolas" w:hAnsi="Consolas" w:eastAsia="Consolas"/>
+                <w:b w:val="0"/>
+                <w:color w:val="C0392B"/>
+                <w:sz w:val="18"/>
+              </w:rPr>
+              <w:t>broadband-worker/project.config.json</w:t>
+            </w:r>
+            <w:r>
+              <w:rPr>
+                <w:rFonts w:ascii="宋体" w:hAnsi="宋体" w:eastAsia="宋体"/>
+                <w:b w:val="0"/>
+                <w:sz w:val="19"/>
+              </w:rPr>
+              <w:t xml:space="preserve"> · 后端 </w:t>
+            </w:r>
+            <w:r>
+              <w:rPr>
+                <w:rFonts w:ascii="Consolas" w:hAnsi="Consolas" w:eastAsia="Consolas"/>
+                <w:b w:val="0"/>
+                <w:color w:val="C0392B"/>
+                <w:sz w:val="18"/>
+              </w:rPr>
+              <w:t>app.wechat.miniapp.appid</w:t>
+            </w:r>
+          </w:p>
+        </w:tc>
+        <w:tc>
+          <w:tcPr>
+            <w:tcW w:type="dxa" w:w="2436"/>
+          </w:tcPr>
+          <w:p>
+            <w:r/>
+            <w:r>
+              <w:rPr>
+                <w:rFonts w:ascii="宋体" w:hAnsi="宋体" w:eastAsia="宋体"/>
+                <w:b w:val="0"/>
+                <w:sz w:val="19"/>
+              </w:rPr>
+              <w:t>✅ 已配置</w:t>
+            </w:r>
+          </w:p>
+        </w:tc>
+        <w:tc>
+          <w:tcPr>
+            <w:tcW w:type="dxa" w:w="2436"/>
+          </w:tcPr>
+          <w:p>
+            <w:r/>
+            <w:r>
+              <w:rPr>
+                <w:rFonts w:ascii="Consolas" w:hAnsi="Consolas" w:eastAsia="Consolas"/>
+                <w:b w:val="0"/>
+                <w:color w:val="C0392B"/>
+                <w:sz w:val="18"/>
+              </w:rPr>
+              <w:t>wxcc344ad7f4f849d4</w:t>
+            </w:r>
+            <w:r>
+              <w:rPr>
+                <w:rFonts w:ascii="宋体" w:hAnsi="宋体" w:eastAsia="宋体"/>
+                <w:b w:val="0"/>
+                <w:sz w:val="19"/>
+              </w:rPr>
+              <w:t>；两端共用，提审前确认是否需拆分（见第 2 节备注）</w:t>
+            </w:r>
+          </w:p>
+        </w:tc>
+      </w:tr>
+      <w:tr>
+        <w:tc>
+          <w:tcPr>
+            <w:tcW w:type="dxa" w:w="2436"/>
+            <w:shd w:val="clear" w:color="auto" w:fill="F2F6FA"/>
+          </w:tcPr>
+          <w:p>
+            <w:r/>
+            <w:r>
+              <w:rPr>
+                <w:rFonts w:ascii="宋体" w:hAnsi="宋体" w:eastAsia="宋体"/>
+                <w:b w:val="0"/>
+                <w:sz w:val="19"/>
+              </w:rPr>
+              <w:t>微信小程序 AppSecret</w:t>
+            </w:r>
+          </w:p>
+        </w:tc>
+        <w:tc>
+          <w:tcPr>
+            <w:tcW w:type="dxa" w:w="2436"/>
+            <w:shd w:val="clear" w:color="auto" w:fill="F2F6FA"/>
+          </w:tcPr>
+          <w:p>
+            <w:r/>
+            <w:r>
+              <w:rPr>
+                <w:rFonts w:ascii="宋体" w:hAnsi="宋体" w:eastAsia="宋体"/>
+                <w:b w:val="0"/>
+                <w:sz w:val="19"/>
+              </w:rPr>
+              <w:t xml:space="preserve">环境变量 </w:t>
+            </w:r>
+            <w:r>
+              <w:rPr>
+                <w:rFonts w:ascii="Consolas" w:hAnsi="Consolas" w:eastAsia="Consolas"/>
+                <w:b w:val="0"/>
+                <w:color w:val="C0392B"/>
+                <w:sz w:val="18"/>
+              </w:rPr>
+              <w:t>WECHAT_SECRET</w:t>
+            </w:r>
+          </w:p>
+        </w:tc>
+        <w:tc>
+          <w:tcPr>
+            <w:tcW w:type="dxa" w:w="2436"/>
+            <w:shd w:val="clear" w:color="auto" w:fill="F2F6FA"/>
+          </w:tcPr>
+          <w:p>
+            <w:r/>
+            <w:r>
+              <w:rPr>
+                <w:rFonts w:ascii="宋体" w:hAnsi="宋体" w:eastAsia="宋体"/>
+                <w:b w:val="0"/>
+                <w:sz w:val="19"/>
+              </w:rPr>
+              <w:t>⬜ 待提供</w:t>
+            </w:r>
+          </w:p>
+        </w:tc>
+        <w:tc>
+          <w:tcPr>
+            <w:tcW w:type="dxa" w:w="2436"/>
+            <w:shd w:val="clear" w:color="auto" w:fill="F2F6FA"/>
+          </w:tcPr>
+          <w:p>
+            <w:r/>
+            <w:r>
+              <w:rPr>
+                <w:rFonts w:ascii="宋体" w:hAnsi="宋体" w:eastAsia="宋体"/>
+                <w:b/>
+                <w:sz w:val="19"/>
+              </w:rPr>
+              <w:t>缺失即自动回退演示码 1234</w:t>
+            </w:r>
+            <w:r>
+              <w:rPr>
+                <w:rFonts w:ascii="宋体" w:hAnsi="宋体" w:eastAsia="宋体"/>
+                <w:b w:val="0"/>
+                <w:sz w:val="19"/>
+              </w:rPr>
+              <w:t xml:space="preserve">；注入后前端无需改代码，后端自动走 </w:t>
+            </w:r>
+            <w:r>
+              <w:rPr>
+                <w:rFonts w:ascii="Consolas" w:hAnsi="Consolas" w:eastAsia="Consolas"/>
+                <w:b w:val="0"/>
+                <w:color w:val="C0392B"/>
+                <w:sz w:val="18"/>
+              </w:rPr>
+              <w:t>code2Session</w:t>
+            </w:r>
+          </w:p>
+        </w:tc>
+      </w:tr>
+      <w:tr>
+        <w:tc>
+          <w:tcPr>
+            <w:tcW w:type="dxa" w:w="2436"/>
+          </w:tcPr>
+          <w:p>
+            <w:r/>
+            <w:r>
+              <w:rPr>
+                <w:rFonts w:ascii="宋体" w:hAnsi="宋体" w:eastAsia="宋体"/>
+                <w:b w:val="0"/>
+                <w:sz w:val="19"/>
+              </w:rPr>
+              <w:t>JWT 密钥</w:t>
+            </w:r>
+          </w:p>
+        </w:tc>
+        <w:tc>
+          <w:tcPr>
+            <w:tcW w:type="dxa" w:w="2436"/>
+          </w:tcPr>
+          <w:p>
+            <w:r/>
+            <w:r>
+              <w:rPr>
+                <w:rFonts w:ascii="Consolas" w:hAnsi="Consolas" w:eastAsia="Consolas"/>
+                <w:b w:val="0"/>
+                <w:color w:val="C0392B"/>
+                <w:sz w:val="18"/>
+              </w:rPr>
+              <w:t>app.jwt.secret</w:t>
+            </w:r>
+            <w:r>
+              <w:rPr>
+                <w:rFonts w:ascii="宋体" w:hAnsi="宋体" w:eastAsia="宋体"/>
+                <w:b w:val="0"/>
+                <w:sz w:val="19"/>
+              </w:rPr>
+              <w:t>（建议环境变量覆盖）</w:t>
+            </w:r>
+          </w:p>
+        </w:tc>
+        <w:tc>
+          <w:tcPr>
+            <w:tcW w:type="dxa" w:w="2436"/>
+          </w:tcPr>
+          <w:p>
+            <w:r/>
+            <w:r>
+              <w:rPr>
+                <w:rFonts w:ascii="宋体" w:hAnsi="宋体" w:eastAsia="宋体"/>
+                <w:b w:val="0"/>
+                <w:sz w:val="19"/>
+              </w:rPr>
+              <w:t>✅ 已配置（默认）</w:t>
+            </w:r>
+          </w:p>
+        </w:tc>
+        <w:tc>
+          <w:tcPr>
+            <w:tcW w:type="dxa" w:w="2436"/>
+          </w:tcPr>
+          <w:p>
+            <w:r/>
+            <w:r>
+              <w:rPr>
+                <w:rFonts w:ascii="宋体" w:hAnsi="宋体" w:eastAsia="宋体"/>
+                <w:b w:val="0"/>
+                <w:sz w:val="19"/>
+              </w:rPr>
+              <w:t>生产环境必须覆盖默认值并首次登录后改密</w:t>
+            </w:r>
+          </w:p>
+        </w:tc>
+      </w:tr>
+      <w:tr>
+        <w:tc>
+          <w:tcPr>
+            <w:tcW w:type="dxa" w:w="2436"/>
+            <w:shd w:val="clear" w:color="auto" w:fill="F2F6FA"/>
+          </w:tcPr>
+          <w:p>
+            <w:r/>
+            <w:r>
+              <w:rPr>
+                <w:rFonts w:ascii="宋体" w:hAnsi="宋体" w:eastAsia="宋体"/>
+                <w:b w:val="0"/>
+                <w:sz w:val="19"/>
+              </w:rPr>
+              <w:t>MySQL 连接</w:t>
+            </w:r>
+          </w:p>
+        </w:tc>
+        <w:tc>
+          <w:tcPr>
+            <w:tcW w:type="dxa" w:w="2436"/>
+            <w:shd w:val="clear" w:color="auto" w:fill="F2F6FA"/>
+          </w:tcPr>
+          <w:p>
+            <w:r/>
+            <w:r>
+              <w:rPr>
+                <w:rFonts w:ascii="Consolas" w:hAnsi="Consolas" w:eastAsia="Consolas"/>
+                <w:b w:val="0"/>
+                <w:color w:val="C0392B"/>
+                <w:sz w:val="18"/>
+              </w:rPr>
+              <w:t>DB_HOST</w:t>
+            </w:r>
+            <w:r>
+              <w:rPr>
+                <w:rFonts w:ascii="宋体" w:hAnsi="宋体" w:eastAsia="宋体"/>
+                <w:b w:val="0"/>
+                <w:sz w:val="19"/>
+              </w:rPr>
+              <w:t xml:space="preserve"> / </w:t>
+            </w:r>
+            <w:r>
+              <w:rPr>
+                <w:rFonts w:ascii="Consolas" w:hAnsi="Consolas" w:eastAsia="Consolas"/>
+                <w:b w:val="0"/>
+                <w:color w:val="C0392B"/>
+                <w:sz w:val="18"/>
+              </w:rPr>
+              <w:t>DB_PORT</w:t>
+            </w:r>
+            <w:r>
+              <w:rPr>
+                <w:rFonts w:ascii="宋体" w:hAnsi="宋体" w:eastAsia="宋体"/>
+                <w:b w:val="0"/>
+                <w:sz w:val="19"/>
+              </w:rPr>
+              <w:t xml:space="preserve"> / </w:t>
+            </w:r>
+            <w:r>
+              <w:rPr>
+                <w:rFonts w:ascii="Consolas" w:hAnsi="Consolas" w:eastAsia="Consolas"/>
+                <w:b w:val="0"/>
+                <w:color w:val="C0392B"/>
+                <w:sz w:val="18"/>
+              </w:rPr>
+              <w:t>DB_NAME</w:t>
+            </w:r>
+            <w:r>
+              <w:rPr>
+                <w:rFonts w:ascii="宋体" w:hAnsi="宋体" w:eastAsia="宋体"/>
+                <w:b w:val="0"/>
+                <w:sz w:val="19"/>
+              </w:rPr>
+              <w:t xml:space="preserve"> / </w:t>
+            </w:r>
+            <w:r>
+              <w:rPr>
+                <w:rFonts w:ascii="Consolas" w:hAnsi="Consolas" w:eastAsia="Consolas"/>
+                <w:b w:val="0"/>
+                <w:color w:val="C0392B"/>
+                <w:sz w:val="18"/>
+              </w:rPr>
+              <w:t>DB_USERNAME</w:t>
+            </w:r>
+            <w:r>
+              <w:rPr>
+                <w:rFonts w:ascii="宋体" w:hAnsi="宋体" w:eastAsia="宋体"/>
+                <w:b w:val="0"/>
+                <w:sz w:val="19"/>
+              </w:rPr>
+              <w:t xml:space="preserve"> / </w:t>
+            </w:r>
+            <w:r>
+              <w:rPr>
+                <w:rFonts w:ascii="Consolas" w:hAnsi="Consolas" w:eastAsia="Consolas"/>
+                <w:b w:val="0"/>
+                <w:color w:val="C0392B"/>
+                <w:sz w:val="18"/>
+              </w:rPr>
+              <w:t>DB_PASSWORD</w:t>
+            </w:r>
+          </w:p>
+        </w:tc>
+        <w:tc>
+          <w:tcPr>
+            <w:tcW w:type="dxa" w:w="2436"/>
+            <w:shd w:val="clear" w:color="auto" w:fill="F2F6FA"/>
+          </w:tcPr>
+          <w:p>
+            <w:r/>
+            <w:r>
+              <w:rPr>
+                <w:rFonts w:ascii="宋体" w:hAnsi="宋体" w:eastAsia="宋体"/>
+                <w:b w:val="0"/>
+                <w:sz w:val="19"/>
+              </w:rPr>
+              <w:t>✅ 本地已通</w:t>
+            </w:r>
+          </w:p>
+        </w:tc>
+        <w:tc>
+          <w:tcPr>
+            <w:tcW w:type="dxa" w:w="2436"/>
+            <w:shd w:val="clear" w:color="auto" w:fill="F2F6FA"/>
+          </w:tcPr>
+          <w:p>
+            <w:r/>
+            <w:r>
+              <w:rPr>
+                <w:rFonts w:ascii="宋体" w:hAnsi="宋体" w:eastAsia="宋体"/>
+                <w:b w:val="0"/>
+                <w:sz w:val="19"/>
+              </w:rPr>
+              <w:t>生产库凭据走环境变量，不入库</w:t>
+            </w:r>
+          </w:p>
+        </w:tc>
+      </w:tr>
+      <w:tr>
+        <w:tc>
+          <w:tcPr>
+            <w:tcW w:type="dxa" w:w="2436"/>
+          </w:tcPr>
+          <w:p>
+            <w:r/>
+            <w:r>
+              <w:rPr>
+                <w:rFonts w:ascii="宋体" w:hAnsi="宋体" w:eastAsia="宋体"/>
+                <w:b w:val="0"/>
+                <w:sz w:val="19"/>
+              </w:rPr>
+              <w:t>客户端鉴权开关</w:t>
+            </w:r>
+          </w:p>
+        </w:tc>
+        <w:tc>
+          <w:tcPr>
+            <w:tcW w:type="dxa" w:w="2436"/>
+          </w:tcPr>
+          <w:p>
+            <w:r/>
+            <w:r>
+              <w:rPr>
+                <w:rFonts w:ascii="Consolas" w:hAnsi="Consolas" w:eastAsia="Consolas"/>
+                <w:b w:val="0"/>
+                <w:color w:val="C0392B"/>
+                <w:sz w:val="18"/>
+              </w:rPr>
+              <w:t>app.security.protect-client-api</w:t>
+            </w:r>
+          </w:p>
+        </w:tc>
+        <w:tc>
+          <w:tcPr>
+            <w:tcW w:type="dxa" w:w="2436"/>
+          </w:tcPr>
+          <w:p>
+            <w:r/>
+            <w:r>
+              <w:rPr>
+                <w:rFonts w:ascii="宋体" w:hAnsi="宋体" w:eastAsia="宋体"/>
+                <w:b w:val="0"/>
+                <w:sz w:val="19"/>
+              </w:rPr>
+              <w:t xml:space="preserve">✅ </w:t>
+            </w:r>
+            <w:r>
+              <w:rPr>
+                <w:rFonts w:ascii="Consolas" w:hAnsi="Consolas" w:eastAsia="Consolas"/>
+                <w:b w:val="0"/>
+                <w:color w:val="C0392B"/>
+                <w:sz w:val="18"/>
+              </w:rPr>
+              <w:t>true</w:t>
+            </w:r>
+          </w:p>
+        </w:tc>
+        <w:tc>
+          <w:tcPr>
+            <w:tcW w:type="dxa" w:w="2436"/>
+          </w:tcPr>
+          <w:p>
+            <w:r/>
+            <w:r>
+              <w:rPr>
+                <w:rFonts w:ascii="宋体" w:hAnsi="宋体" w:eastAsia="宋体"/>
+                <w:b w:val="0"/>
+                <w:sz w:val="19"/>
+              </w:rPr>
+              <w:t xml:space="preserve">v1.5 起 C 端接口强制鉴权；如需临时开放置 </w:t>
+            </w:r>
+            <w:r>
+              <w:rPr>
+                <w:rFonts w:ascii="Consolas" w:hAnsi="Consolas" w:eastAsia="Consolas"/>
+                <w:b w:val="0"/>
+                <w:color w:val="C0392B"/>
+                <w:sz w:val="18"/>
+              </w:rPr>
+              <w:t>false</w:t>
+            </w:r>
+            <w:r>
+              <w:rPr>
+                <w:rFonts w:ascii="宋体" w:hAnsi="宋体" w:eastAsia="宋体"/>
+                <w:b w:val="0"/>
+                <w:sz w:val="19"/>
+              </w:rPr>
+              <w:t xml:space="preserve"> 即可</w:t>
+            </w:r>
+          </w:p>
+        </w:tc>
+      </w:tr>
+    </w:tbl>
+    <w:p/>
     <w:p>
       <w:pPr>
         <w:pStyle w:val="Heading1"/>

</xml_diff>